<commit_message>
Project 2026-27 version (exposition of a paper) created, and Syllabus updated to 2026-27 version
</commit_message>
<xml_diff>
--- a/0_SYLLABUS/Syllabus_G351_QuantitativeMethodsForHumanities_2025-26.docx
+++ b/0_SYLLABUS/Syllabus_G351_QuantitativeMethodsForHumanities_2025-26.docx
@@ -141,6 +141,7 @@
                 <w:lang w:val="en-US"/>
               </w:rPr>
             </w:pPr>
+            <w:proofErr w:type="spellStart"/>
             <w:r>
               <w:rPr>
                 <w:rFonts w:cstheme="minorHAnsi"/>
@@ -149,8 +150,75 @@
                 <w:szCs w:val="24"/>
                 <w:shd w:val="clear" w:color="auto" w:fill="FFFFFF"/>
               </w:rPr>
-              <w:t>Quantitative Methods for Humanities</w:t>
-            </w:r>
+              <w:t>Quantitative</w:t>
+            </w:r>
+            <w:proofErr w:type="spellEnd"/>
+            <w:r>
+              <w:rPr>
+                <w:rFonts w:cstheme="minorHAnsi"/>
+                <w:color w:val="000000"/>
+                <w:sz w:val="24"/>
+                <w:szCs w:val="24"/>
+                <w:shd w:val="clear" w:color="auto" w:fill="FFFFFF"/>
+              </w:rPr>
+              <w:t xml:space="preserve"> </w:t>
+            </w:r>
+            <w:proofErr w:type="spellStart"/>
+            <w:r>
+              <w:rPr>
+                <w:rFonts w:cstheme="minorHAnsi"/>
+                <w:color w:val="000000"/>
+                <w:sz w:val="24"/>
+                <w:szCs w:val="24"/>
+                <w:shd w:val="clear" w:color="auto" w:fill="FFFFFF"/>
+              </w:rPr>
+              <w:t>Methods</w:t>
+            </w:r>
+            <w:proofErr w:type="spellEnd"/>
+            <w:r>
+              <w:rPr>
+                <w:rFonts w:cstheme="minorHAnsi"/>
+                <w:color w:val="000000"/>
+                <w:sz w:val="24"/>
+                <w:szCs w:val="24"/>
+                <w:shd w:val="clear" w:color="auto" w:fill="FFFFFF"/>
+              </w:rPr>
+              <w:t xml:space="preserve"> </w:t>
+            </w:r>
+            <w:proofErr w:type="spellStart"/>
+            <w:r>
+              <w:rPr>
+                <w:rFonts w:cstheme="minorHAnsi"/>
+                <w:color w:val="000000"/>
+                <w:sz w:val="24"/>
+                <w:szCs w:val="24"/>
+                <w:shd w:val="clear" w:color="auto" w:fill="FFFFFF"/>
+              </w:rPr>
+              <w:t>for</w:t>
+            </w:r>
+            <w:proofErr w:type="spellEnd"/>
+            <w:r>
+              <w:rPr>
+                <w:rFonts w:cstheme="minorHAnsi"/>
+                <w:color w:val="000000"/>
+                <w:sz w:val="24"/>
+                <w:szCs w:val="24"/>
+                <w:shd w:val="clear" w:color="auto" w:fill="FFFFFF"/>
+              </w:rPr>
+              <w:t xml:space="preserve"> </w:t>
+            </w:r>
+            <w:proofErr w:type="spellStart"/>
+            <w:r>
+              <w:rPr>
+                <w:rFonts w:cstheme="minorHAnsi"/>
+                <w:color w:val="000000"/>
+                <w:sz w:val="24"/>
+                <w:szCs w:val="24"/>
+                <w:shd w:val="clear" w:color="auto" w:fill="FFFFFF"/>
+              </w:rPr>
+              <w:t>Humanities</w:t>
+            </w:r>
+            <w:proofErr w:type="spellEnd"/>
           </w:p>
         </w:tc>
         <w:tc>
@@ -937,7 +1005,27 @@
           <w:szCs w:val="20"/>
           <w:lang w:val="en-US"/>
         </w:rPr>
-        <w:t>Co5: Formulate critical and well-reasoned arguments, using precise terminology, specialised resources, and documents to support them, to be presented either in a written or oral way.</w:t>
+        <w:t xml:space="preserve">Co5: Formulate critical and well-reasoned arguments, using precise terminology, </w:t>
+      </w:r>
+      <w:proofErr w:type="spellStart"/>
+      <w:r>
+        <w:rPr>
+          <w:rFonts w:cstheme="minorHAnsi"/>
+          <w:sz w:val="20"/>
+          <w:szCs w:val="20"/>
+          <w:lang w:val="en-US"/>
+        </w:rPr>
+        <w:t>specialised</w:t>
+      </w:r>
+      <w:proofErr w:type="spellEnd"/>
+      <w:r>
+        <w:rPr>
+          <w:rFonts w:cstheme="minorHAnsi"/>
+          <w:sz w:val="20"/>
+          <w:szCs w:val="20"/>
+          <w:lang w:val="en-US"/>
+        </w:rPr>
+        <w:t xml:space="preserve"> resources, and documents to support them, to be presented either in a written or oral way.</w:t>
       </w:r>
     </w:p>
     <w:p>
@@ -1026,6 +1114,7 @@
           <w:b/>
           <w:sz w:val="20"/>
           <w:szCs w:val="20"/>
+          <w:lang w:val="en-GB"/>
         </w:rPr>
       </w:pPr>
       <w:r>
@@ -1034,8 +1123,29 @@
           <w:b/>
           <w:sz w:val="20"/>
           <w:szCs w:val="20"/>
-        </w:rPr>
-        <w:t>Module 1. Introduction to R</w:t>
+          <w:lang w:val="en-GB"/>
+        </w:rPr>
+        <w:t xml:space="preserve">Module </w:t>
+      </w:r>
+      <w:r>
+        <w:rPr>
+          <w:rFonts w:cstheme="minorHAnsi"/>
+          <w:b/>
+          <w:sz w:val="20"/>
+          <w:szCs w:val="20"/>
+          <w:lang w:val="en-GB"/>
+        </w:rPr>
+        <w:t>0 (Optional)</w:t>
+      </w:r>
+      <w:r>
+        <w:rPr>
+          <w:rFonts w:cstheme="minorHAnsi"/>
+          <w:b/>
+          <w:sz w:val="20"/>
+          <w:szCs w:val="20"/>
+          <w:lang w:val="en-GB"/>
+        </w:rPr>
+        <w:t>. Introduction to R</w:t>
       </w:r>
     </w:p>
     <w:p>
@@ -1157,13 +1267,23 @@
           <w:lang w:val="en-GB"/>
         </w:rPr>
       </w:pPr>
-      <w:r>
-        <w:rPr>
-          <w:sz w:val="20"/>
-          <w:szCs w:val="20"/>
-          <w:lang w:val="en-GB"/>
-        </w:rPr>
-        <w:t xml:space="preserve">Subsetting. </w:t>
+      <w:proofErr w:type="spellStart"/>
+      <w:r>
+        <w:rPr>
+          <w:sz w:val="20"/>
+          <w:szCs w:val="20"/>
+          <w:lang w:val="en-GB"/>
+        </w:rPr>
+        <w:t>Subsetting</w:t>
+      </w:r>
+      <w:proofErr w:type="spellEnd"/>
+      <w:r>
+        <w:rPr>
+          <w:sz w:val="20"/>
+          <w:szCs w:val="20"/>
+          <w:lang w:val="en-GB"/>
+        </w:rPr>
+        <w:t xml:space="preserve">. </w:t>
       </w:r>
     </w:p>
     <w:p>
@@ -1262,6 +1382,32 @@
     </w:p>
     <w:p>
       <w:pPr>
+        <w:pStyle w:val="ListParagraph"/>
+        <w:numPr>
+          <w:ilvl w:val="1"/>
+          <w:numId w:val="21"/>
+        </w:numPr>
+        <w:spacing w:after="0" w:line="240" w:lineRule="auto"/>
+        <w:jc w:val="both"/>
+        <w:rPr>
+          <w:rFonts w:cstheme="minorHAnsi"/>
+          <w:b/>
+          <w:sz w:val="20"/>
+          <w:szCs w:val="20"/>
+          <w:lang w:val="en-GB"/>
+        </w:rPr>
+      </w:pPr>
+      <w:r>
+        <w:rPr>
+          <w:sz w:val="20"/>
+          <w:szCs w:val="20"/>
+          <w:lang w:val="en-GB"/>
+        </w:rPr>
+        <w:t>Using AI as a coding companion.</w:t>
+      </w:r>
+    </w:p>
+    <w:p>
+      <w:pPr>
         <w:spacing w:after="0" w:line="240" w:lineRule="auto"/>
         <w:jc w:val="both"/>
         <w:rPr>
@@ -1512,13 +1658,66 @@
     </w:p>
     <w:p>
       <w:pPr>
+        <w:pStyle w:val="ListParagraph"/>
+        <w:numPr>
+          <w:ilvl w:val="1"/>
+          <w:numId w:val="20"/>
+        </w:numPr>
         <w:spacing w:after="0" w:line="240" w:lineRule="auto"/>
         <w:jc w:val="both"/>
         <w:rPr>
           <w:rFonts w:cstheme="minorHAnsi"/>
+          <w:bCs/>
+          <w:sz w:val="20"/>
+          <w:szCs w:val="20"/>
+          <w:lang w:val="en-GB"/>
+        </w:rPr>
+      </w:pPr>
+      <w:r>
+        <w:rPr>
+          <w:sz w:val="20"/>
+          <w:szCs w:val="20"/>
+          <w:lang w:val="en-GB"/>
+        </w:rPr>
+        <w:t>Law of large numbers and Central Limit Theorem.</w:t>
+      </w:r>
+    </w:p>
+    <w:p>
+      <w:pPr>
+        <w:pStyle w:val="ListParagraph"/>
+        <w:numPr>
+          <w:ilvl w:val="1"/>
+          <w:numId w:val="20"/>
+        </w:numPr>
+        <w:spacing w:after="0" w:line="240" w:lineRule="auto"/>
+        <w:jc w:val="both"/>
+        <w:rPr>
+          <w:rFonts w:cstheme="minorHAnsi"/>
+          <w:bCs/>
+          <w:sz w:val="20"/>
+          <w:szCs w:val="20"/>
+          <w:lang w:val="en-GB"/>
+        </w:rPr>
+      </w:pPr>
+      <w:r>
+        <w:rPr>
+          <w:sz w:val="20"/>
+          <w:szCs w:val="20"/>
+          <w:lang w:val="en-GB"/>
+        </w:rPr>
+        <w:t>Hypothesis tests of the difference of means.</w:t>
+      </w:r>
+    </w:p>
+    <w:p>
+      <w:pPr>
+        <w:spacing w:after="0" w:line="240" w:lineRule="auto"/>
+        <w:jc w:val="both"/>
+        <w:rPr>
+          <w:rFonts w:cstheme="minorHAnsi"/>
           <w:b/>
           <w:sz w:val="20"/>
           <w:szCs w:val="20"/>
+          <w:lang w:val="en-GB"/>
         </w:rPr>
       </w:pPr>
     </w:p>
@@ -1688,6 +1887,7 @@
           <w:szCs w:val="20"/>
           <w:lang w:val="en-GB"/>
         </w:rPr>
+        <w:lastRenderedPageBreak/>
         <w:t xml:space="preserve">The Potential Outcomes Framework (POF). Potential outcomes, causal effect, counterfactuals. </w:t>
       </w:r>
     </w:p>
@@ -1761,6 +1961,21 @@
     </w:p>
     <w:p>
       <w:pPr>
+        <w:pStyle w:val="ListParagraph"/>
+        <w:spacing w:after="0" w:line="240" w:lineRule="auto"/>
+        <w:ind w:left="785"/>
+        <w:jc w:val="both"/>
+        <w:rPr>
+          <w:rFonts w:cstheme="minorHAnsi"/>
+          <w:bCs/>
+          <w:sz w:val="20"/>
+          <w:szCs w:val="20"/>
+          <w:lang w:val="en-GB"/>
+        </w:rPr>
+      </w:pPr>
+    </w:p>
+    <w:p>
+      <w:pPr>
         <w:spacing w:after="0" w:line="240" w:lineRule="auto"/>
         <w:jc w:val="both"/>
         <w:rPr>
@@ -1779,7 +1994,6 @@
           <w:szCs w:val="20"/>
           <w:lang w:val="en-GB"/>
         </w:rPr>
-        <w:lastRenderedPageBreak/>
         <w:t xml:space="preserve">Module </w:t>
       </w:r>
       <w:r>
@@ -1922,7 +2136,31 @@
           <w:szCs w:val="20"/>
           <w:lang w:val="en-GB"/>
         </w:rPr>
-        <w:t>Quasi-experimental methods. Control and instrumental variables, difference-in</w:t>
+        <w:t xml:space="preserve">Quasi-experimental methods. Control and instrumental variables, </w:t>
+      </w:r>
+      <w:r>
+        <w:rPr>
+          <w:sz w:val="20"/>
+          <w:szCs w:val="20"/>
+          <w:lang w:val="en-GB"/>
+        </w:rPr>
+        <w:t xml:space="preserve">Before-and-After and </w:t>
+      </w:r>
+      <w:r>
+        <w:rPr>
+          <w:sz w:val="20"/>
+          <w:szCs w:val="20"/>
+          <w:lang w:val="en-GB"/>
+        </w:rPr>
+        <w:t>D</w:t>
+      </w:r>
+      <w:r>
+        <w:rPr>
+          <w:sz w:val="20"/>
+          <w:szCs w:val="20"/>
+          <w:lang w:val="en-GB"/>
+        </w:rPr>
+        <w:t>ifference-in</w:t>
       </w:r>
       <w:r>
         <w:rPr>
@@ -1938,7 +2176,31 @@
           <w:szCs w:val="20"/>
           <w:lang w:val="en-GB"/>
         </w:rPr>
-        <w:t xml:space="preserve">differences design, regression discontinuity design, etc. </w:t>
+        <w:t>D</w:t>
+      </w:r>
+      <w:r>
+        <w:rPr>
+          <w:sz w:val="20"/>
+          <w:szCs w:val="20"/>
+          <w:lang w:val="en-GB"/>
+        </w:rPr>
+        <w:t>ifferences design</w:t>
+      </w:r>
+      <w:r>
+        <w:rPr>
+          <w:sz w:val="20"/>
+          <w:szCs w:val="20"/>
+          <w:lang w:val="en-GB"/>
+        </w:rPr>
+        <w:t>s</w:t>
+      </w:r>
+      <w:r>
+        <w:rPr>
+          <w:sz w:val="20"/>
+          <w:szCs w:val="20"/>
+          <w:lang w:val="en-GB"/>
+        </w:rPr>
+        <w:t xml:space="preserve">. </w:t>
       </w:r>
     </w:p>
     <w:p>
@@ -1958,12 +2220,53 @@
           <w:lang w:val="en-GB"/>
         </w:rPr>
       </w:pPr>
-      <w:r>
-        <w:rPr>
-          <w:sz w:val="20"/>
-          <w:szCs w:val="20"/>
-        </w:rPr>
-        <w:t>Internal and external validity.</w:t>
+      <w:proofErr w:type="spellStart"/>
+      <w:r>
+        <w:rPr>
+          <w:sz w:val="20"/>
+          <w:szCs w:val="20"/>
+        </w:rPr>
+        <w:t>Internal</w:t>
+      </w:r>
+      <w:proofErr w:type="spellEnd"/>
+      <w:r>
+        <w:rPr>
+          <w:sz w:val="20"/>
+          <w:szCs w:val="20"/>
+        </w:rPr>
+        <w:t xml:space="preserve"> and </w:t>
+      </w:r>
+      <w:proofErr w:type="spellStart"/>
+      <w:r>
+        <w:rPr>
+          <w:sz w:val="20"/>
+          <w:szCs w:val="20"/>
+        </w:rPr>
+        <w:t>external</w:t>
+      </w:r>
+      <w:proofErr w:type="spellEnd"/>
+      <w:r>
+        <w:rPr>
+          <w:sz w:val="20"/>
+          <w:szCs w:val="20"/>
+        </w:rPr>
+        <w:t xml:space="preserve"> </w:t>
+      </w:r>
+      <w:proofErr w:type="spellStart"/>
+      <w:r>
+        <w:rPr>
+          <w:sz w:val="20"/>
+          <w:szCs w:val="20"/>
+        </w:rPr>
+        <w:t>validity</w:t>
+      </w:r>
+      <w:proofErr w:type="spellEnd"/>
+      <w:r>
+        <w:rPr>
+          <w:sz w:val="20"/>
+          <w:szCs w:val="20"/>
+        </w:rPr>
+        <w:t>.</w:t>
       </w:r>
     </w:p>
     <w:p>
@@ -2258,7 +2561,23 @@
           <w:szCs w:val="20"/>
           <w:lang w:val="en-GB"/>
         </w:rPr>
-        <w:t xml:space="preserve">omitted variable basis. </w:t>
+        <w:t xml:space="preserve">omitted variable </w:t>
+      </w:r>
+      <w:r>
+        <w:rPr>
+          <w:sz w:val="20"/>
+          <w:szCs w:val="20"/>
+          <w:lang w:val="en-GB"/>
+        </w:rPr>
+        <w:t>bias</w:t>
+      </w:r>
+      <w:r>
+        <w:rPr>
+          <w:sz w:val="20"/>
+          <w:szCs w:val="20"/>
+          <w:lang w:val="en-GB"/>
+        </w:rPr>
+        <w:t xml:space="preserve">. </w:t>
       </w:r>
     </w:p>
     <w:p>
@@ -2310,7 +2629,97 @@
           <w:szCs w:val="20"/>
           <w:lang w:val="en-GB"/>
         </w:rPr>
-        <w:t xml:space="preserve">The LRM and quasi-experimental methods. Control and instrumental variables, the regression discontinuity design. </w:t>
+        <w:t>The LRM and quasi-experimental methods. Control and instrumental variables</w:t>
+      </w:r>
+      <w:r>
+        <w:rPr>
+          <w:sz w:val="20"/>
+          <w:szCs w:val="20"/>
+          <w:lang w:val="en-GB"/>
+        </w:rPr>
+        <w:t>.</w:t>
+      </w:r>
+      <w:r>
+        <w:rPr>
+          <w:sz w:val="20"/>
+          <w:szCs w:val="20"/>
+          <w:lang w:val="en-GB"/>
+        </w:rPr>
+        <w:t xml:space="preserve"> </w:t>
+      </w:r>
+      <w:r>
+        <w:rPr>
+          <w:sz w:val="20"/>
+          <w:szCs w:val="20"/>
+          <w:lang w:val="en-GB"/>
+        </w:rPr>
+        <w:t>T</w:t>
+      </w:r>
+      <w:r>
+        <w:rPr>
+          <w:sz w:val="20"/>
+          <w:szCs w:val="20"/>
+          <w:lang w:val="en-GB"/>
+        </w:rPr>
+        <w:t xml:space="preserve">he </w:t>
+      </w:r>
+      <w:r>
+        <w:rPr>
+          <w:sz w:val="20"/>
+          <w:szCs w:val="20"/>
+          <w:lang w:val="en-GB"/>
+        </w:rPr>
+        <w:t>R</w:t>
+      </w:r>
+      <w:r>
+        <w:rPr>
+          <w:sz w:val="20"/>
+          <w:szCs w:val="20"/>
+          <w:lang w:val="en-GB"/>
+        </w:rPr>
+        <w:t>egression</w:t>
+      </w:r>
+      <w:r>
+        <w:rPr>
+          <w:sz w:val="20"/>
+          <w:szCs w:val="20"/>
+          <w:lang w:val="en-GB"/>
+        </w:rPr>
+        <w:t>-D</w:t>
+      </w:r>
+      <w:r>
+        <w:rPr>
+          <w:sz w:val="20"/>
+          <w:szCs w:val="20"/>
+          <w:lang w:val="en-GB"/>
+        </w:rPr>
+        <w:t xml:space="preserve">iscontinuity design. </w:t>
+      </w:r>
+    </w:p>
+    <w:p>
+      <w:pPr>
+        <w:pStyle w:val="ListParagraph"/>
+        <w:numPr>
+          <w:ilvl w:val="1"/>
+          <w:numId w:val="22"/>
+        </w:numPr>
+        <w:spacing w:after="0" w:line="240" w:lineRule="auto"/>
+        <w:jc w:val="both"/>
+        <w:rPr>
+          <w:rFonts w:cstheme="minorHAnsi"/>
+          <w:b/>
+          <w:sz w:val="20"/>
+          <w:szCs w:val="20"/>
+          <w:lang w:val="en-GB"/>
+        </w:rPr>
+      </w:pPr>
+      <w:r>
+        <w:rPr>
+          <w:sz w:val="20"/>
+          <w:szCs w:val="20"/>
+          <w:lang w:val="en-GB"/>
+        </w:rPr>
+        <w:t>Interaction and non-linear terms.</w:t>
       </w:r>
     </w:p>
     <w:p>
@@ -2589,7 +2998,47 @@
           <w:szCs w:val="20"/>
           <w:lang w:val="en-US"/>
         </w:rPr>
-        <w:t xml:space="preserve">A continuous assessment process will take place during the course based on the active participation in the classroom, coursework, assignments, intermediate tests and a final exam. The continuous evaluation will weight 40% of the final mark, and the remaining 60% will come from the final exam. The minimum mark required in the final exam to succeed is 5: if this score is not achieved then the final mark will be the one obtained in the final exam. </w:t>
+        <w:t xml:space="preserve">A continuous assessment process will take place during the course based on </w:t>
+      </w:r>
+      <w:proofErr w:type="gramStart"/>
+      <w:r>
+        <w:rPr>
+          <w:rFonts w:cstheme="minorHAnsi"/>
+          <w:sz w:val="20"/>
+          <w:szCs w:val="20"/>
+          <w:lang w:val="en-US"/>
+        </w:rPr>
+        <w:t>the active</w:t>
+      </w:r>
+      <w:proofErr w:type="gramEnd"/>
+      <w:r>
+        <w:rPr>
+          <w:rFonts w:cstheme="minorHAnsi"/>
+          <w:sz w:val="20"/>
+          <w:szCs w:val="20"/>
+          <w:lang w:val="en-US"/>
+        </w:rPr>
+        <w:t xml:space="preserve"> participation in the classroom, coursework, assignments, intermediate tests and a final exam. The continuous evaluation will </w:t>
+      </w:r>
+      <w:proofErr w:type="gramStart"/>
+      <w:r>
+        <w:rPr>
+          <w:rFonts w:cstheme="minorHAnsi"/>
+          <w:sz w:val="20"/>
+          <w:szCs w:val="20"/>
+          <w:lang w:val="en-US"/>
+        </w:rPr>
+        <w:t>weight</w:t>
+      </w:r>
+      <w:proofErr w:type="gramEnd"/>
+      <w:r>
+        <w:rPr>
+          <w:rFonts w:cstheme="minorHAnsi"/>
+          <w:sz w:val="20"/>
+          <w:szCs w:val="20"/>
+          <w:lang w:val="en-US"/>
+        </w:rPr>
+        <w:t xml:space="preserve"> 40% of the final mark, and the remaining 60% will come from the final exam. The minimum mark required in the final exam to succeed is 5: if this score is not achieved then the final mark will be the one obtained in the final exam. </w:t>
       </w:r>
     </w:p>
     <w:p>
@@ -2637,7 +3086,27 @@
           <w:szCs w:val="20"/>
           <w:lang w:val="en-GB"/>
         </w:rPr>
-        <w:t xml:space="preserve">nough as to include the whole curriculum content of the course and it is a written exam. </w:t>
+        <w:t xml:space="preserve">nough as to include the whole curriculum content of the </w:t>
+      </w:r>
+      <w:proofErr w:type="gramStart"/>
+      <w:r>
+        <w:rPr>
+          <w:rFonts w:cstheme="minorHAnsi"/>
+          <w:sz w:val="20"/>
+          <w:szCs w:val="20"/>
+          <w:lang w:val="en-GB"/>
+        </w:rPr>
+        <w:t>course</w:t>
+      </w:r>
+      <w:proofErr w:type="gramEnd"/>
+      <w:r>
+        <w:rPr>
+          <w:rFonts w:cstheme="minorHAnsi"/>
+          <w:sz w:val="20"/>
+          <w:szCs w:val="20"/>
+          <w:lang w:val="en-GB"/>
+        </w:rPr>
+        <w:t xml:space="preserve"> and it is a written exam. </w:t>
       </w:r>
       <w:r>
         <w:rPr>
@@ -3094,7 +3563,15 @@
                 <w:sz w:val="20"/>
                 <w:szCs w:val="20"/>
               </w:rPr>
-              <w:t>5%</w:t>
+              <w:t>10</w:t>
+            </w:r>
+            <w:r>
+              <w:rPr>
+                <w:rFonts w:cstheme="minorHAnsi"/>
+                <w:sz w:val="20"/>
+                <w:szCs w:val="20"/>
+              </w:rPr>
+              <w:t>%</w:t>
             </w:r>
           </w:p>
         </w:tc>
@@ -3159,7 +3636,31 @@
                 <w:szCs w:val="20"/>
                 <w:lang w:val="en-GB"/>
               </w:rPr>
-              <w:t>Practice about statistical software. Submission by a deadline.</w:t>
+              <w:t>Midterm exam</w:t>
+            </w:r>
+            <w:r>
+              <w:rPr>
+                <w:sz w:val="20"/>
+                <w:szCs w:val="20"/>
+                <w:lang w:val="en-GB"/>
+              </w:rPr>
+              <w:t xml:space="preserve"> 1</w:t>
+            </w:r>
+            <w:r>
+              <w:rPr>
+                <w:sz w:val="20"/>
+                <w:szCs w:val="20"/>
+                <w:lang w:val="en-GB"/>
+              </w:rPr>
+              <w:t xml:space="preserve">. </w:t>
+            </w:r>
+            <w:r>
+              <w:rPr>
+                <w:sz w:val="20"/>
+                <w:szCs w:val="20"/>
+                <w:lang w:val="en-GB"/>
+              </w:rPr>
+              <w:t>Written exam about course content</w:t>
             </w:r>
           </w:p>
         </w:tc>
@@ -3259,7 +3760,23 @@
                 <w:sz w:val="20"/>
                 <w:szCs w:val="20"/>
               </w:rPr>
-              <w:t>15%</w:t>
+              <w:t>1</w:t>
+            </w:r>
+            <w:r>
+              <w:rPr>
+                <w:rFonts w:cstheme="minorHAnsi"/>
+                <w:sz w:val="20"/>
+                <w:szCs w:val="20"/>
+              </w:rPr>
+              <w:t>0</w:t>
+            </w:r>
+            <w:r>
+              <w:rPr>
+                <w:rFonts w:cstheme="minorHAnsi"/>
+                <w:sz w:val="20"/>
+                <w:szCs w:val="20"/>
+              </w:rPr>
+              <w:t>%</w:t>
             </w:r>
           </w:p>
         </w:tc>
@@ -3290,6 +3807,7 @@
                 <w:szCs w:val="20"/>
                 <w:lang w:val="en-US"/>
               </w:rPr>
+              <w:lastRenderedPageBreak/>
               <w:t>Description</w:t>
             </w:r>
             <w:r>
@@ -3356,7 +3874,7 @@
                 <w:szCs w:val="20"/>
                 <w:lang w:val="en-GB"/>
               </w:rPr>
-              <w:t xml:space="preserve"> course concepts to real-world data using statistical software</w:t>
+              <w:t xml:space="preserve"> course concepts to </w:t>
             </w:r>
             <w:r>
               <w:rPr>
@@ -3364,7 +3882,47 @@
                 <w:szCs w:val="20"/>
                 <w:lang w:val="en-GB"/>
               </w:rPr>
-              <w:t>. Submission by a deadline.</w:t>
+              <w:t xml:space="preserve">analyse a paper </w:t>
+            </w:r>
+            <w:r>
+              <w:rPr>
+                <w:sz w:val="20"/>
+                <w:szCs w:val="20"/>
+                <w:lang w:val="en-GB"/>
+              </w:rPr>
+              <w:t>on causal inference.</w:t>
+            </w:r>
+            <w:r>
+              <w:rPr>
+                <w:sz w:val="20"/>
+                <w:szCs w:val="20"/>
+                <w:lang w:val="en-GB"/>
+              </w:rPr>
+              <w:t xml:space="preserve"> </w:t>
+            </w:r>
+            <w:r>
+              <w:rPr>
+                <w:sz w:val="20"/>
+                <w:szCs w:val="20"/>
+                <w:lang w:val="en-GB"/>
+              </w:rPr>
+              <w:t>Submission</w:t>
+            </w:r>
+            <w:r>
+              <w:rPr>
+                <w:sz w:val="20"/>
+                <w:szCs w:val="20"/>
+                <w:lang w:val="en-GB"/>
+              </w:rPr>
+              <w:t xml:space="preserve"> and oral presentation</w:t>
+            </w:r>
+            <w:r>
+              <w:rPr>
+                <w:sz w:val="20"/>
+                <w:szCs w:val="20"/>
+                <w:lang w:val="en-GB"/>
+              </w:rPr>
+              <w:t xml:space="preserve"> by a deadline.</w:t>
             </w:r>
           </w:p>
         </w:tc>
@@ -3464,7 +4022,23 @@
                 <w:sz w:val="20"/>
                 <w:szCs w:val="20"/>
               </w:rPr>
-              <w:t>15%</w:t>
+              <w:t>1</w:t>
+            </w:r>
+            <w:r>
+              <w:rPr>
+                <w:rFonts w:cstheme="minorHAnsi"/>
+                <w:sz w:val="20"/>
+                <w:szCs w:val="20"/>
+              </w:rPr>
+              <w:t>0</w:t>
+            </w:r>
+            <w:r>
+              <w:rPr>
+                <w:rFonts w:cstheme="minorHAnsi"/>
+                <w:sz w:val="20"/>
+                <w:szCs w:val="20"/>
+              </w:rPr>
+              <w:t>%</w:t>
             </w:r>
           </w:p>
         </w:tc>
@@ -3529,7 +4103,23 @@
                 <w:szCs w:val="20"/>
                 <w:lang w:val="en-GB"/>
               </w:rPr>
-              <w:t>Midterm exam. Practical exam using statistical software to solve problems.</w:t>
+              <w:t>Midterm exam</w:t>
+            </w:r>
+            <w:r>
+              <w:rPr>
+                <w:sz w:val="20"/>
+                <w:szCs w:val="20"/>
+                <w:lang w:val="en-GB"/>
+              </w:rPr>
+              <w:t xml:space="preserve"> 2</w:t>
+            </w:r>
+            <w:r>
+              <w:rPr>
+                <w:sz w:val="20"/>
+                <w:szCs w:val="20"/>
+                <w:lang w:val="en-GB"/>
+              </w:rPr>
+              <w:t>. Practical exam using statistical software to solve problems.</w:t>
             </w:r>
           </w:p>
         </w:tc>
@@ -4444,7 +5034,29 @@
           <w:szCs w:val="20"/>
           <w:lang w:val="en-GB"/>
         </w:rPr>
-        <w:t>Mastering 'Metrics. The Path From Cause to Effect</w:t>
+        <w:t xml:space="preserve">Mastering 'Metrics. The Path </w:t>
+      </w:r>
+      <w:proofErr w:type="gramStart"/>
+      <w:r>
+        <w:rPr>
+          <w:i/>
+          <w:iCs/>
+          <w:sz w:val="20"/>
+          <w:szCs w:val="20"/>
+          <w:lang w:val="en-GB"/>
+        </w:rPr>
+        <w:t>From</w:t>
+      </w:r>
+      <w:proofErr w:type="gramEnd"/>
+      <w:r>
+        <w:rPr>
+          <w:i/>
+          <w:iCs/>
+          <w:sz w:val="20"/>
+          <w:szCs w:val="20"/>
+          <w:lang w:val="en-GB"/>
+        </w:rPr>
+        <w:t xml:space="preserve"> Cause to Effect</w:t>
       </w:r>
       <w:r>
         <w:rPr>
@@ -4973,8 +5585,17 @@
                 <w:sz w:val="20"/>
                 <w:szCs w:val="20"/>
               </w:rPr>
-              <w:t>R and RStudio</w:t>
-            </w:r>
+              <w:t xml:space="preserve">R and </w:t>
+            </w:r>
+            <w:proofErr w:type="spellStart"/>
+            <w:r>
+              <w:rPr>
+                <w:sz w:val="20"/>
+                <w:szCs w:val="20"/>
+              </w:rPr>
+              <w:t>RStudio</w:t>
+            </w:r>
+            <w:proofErr w:type="spellEnd"/>
           </w:p>
         </w:tc>
       </w:tr>
@@ -5620,6 +6241,7 @@
         <w:szCs w:val="28"/>
       </w:rPr>
     </w:pPr>
+    <w:proofErr w:type="spellStart"/>
     <w:r>
       <w:rPr>
         <w:rFonts w:cstheme="minorHAnsi"/>
@@ -5629,7 +6251,43 @@
         <w:sz w:val="28"/>
         <w:szCs w:val="28"/>
       </w:rPr>
-      <w:t>Academic Year 202</w:t>
+      <w:t>Academic</w:t>
+    </w:r>
+    <w:proofErr w:type="spellEnd"/>
+    <w:r>
+      <w:rPr>
+        <w:rFonts w:cstheme="minorHAnsi"/>
+        <w:b/>
+        <w:bCs/>
+        <w:color w:val="1A1F6C" w:themeColor="text2"/>
+        <w:sz w:val="28"/>
+        <w:szCs w:val="28"/>
+      </w:rPr>
+      <w:t xml:space="preserve"> </w:t>
+    </w:r>
+    <w:proofErr w:type="spellStart"/>
+    <w:r>
+      <w:rPr>
+        <w:rFonts w:cstheme="minorHAnsi"/>
+        <w:b/>
+        <w:bCs/>
+        <w:color w:val="1A1F6C" w:themeColor="text2"/>
+        <w:sz w:val="28"/>
+        <w:szCs w:val="28"/>
+      </w:rPr>
+      <w:t>Year</w:t>
+    </w:r>
+    <w:proofErr w:type="spellEnd"/>
+    <w:r>
+      <w:rPr>
+        <w:rFonts w:cstheme="minorHAnsi"/>
+        <w:b/>
+        <w:bCs/>
+        <w:color w:val="1A1F6C" w:themeColor="text2"/>
+        <w:sz w:val="28"/>
+        <w:szCs w:val="28"/>
+      </w:rPr>
+      <w:t xml:space="preserve"> 202</w:t>
     </w:r>
     <w:r>
       <w:rPr>
@@ -9215,6 +9873,10 @@
 </file>
 
 <file path=customXml/item1.xml><?xml version="1.0" encoding="utf-8"?>
+<b:Sources xmlns:b="http://schemas.openxmlformats.org/officeDocument/2006/bibliography" xmlns="http://schemas.openxmlformats.org/officeDocument/2006/bibliography" SelectedStyle="\APASixthEditionOfficeOnline.xsl" StyleName="APA" Version="6"/>
+</file>
+
+<file path=customXml/item2.xml><?xml version="1.0" encoding="utf-8"?>
 <ct:contentTypeSchema xmlns:ct="http://schemas.microsoft.com/office/2006/metadata/contentType" xmlns:ma="http://schemas.microsoft.com/office/2006/metadata/properties/metaAttributes" ct:_="" ma:_="" ma:contentTypeName="Documento" ma:contentTypeID="0x010100827B7C58A6CBC9489DD9874A23AA1EAC" ma:contentTypeVersion="13" ma:contentTypeDescription="Crear nuevo documento." ma:contentTypeScope="" ma:versionID="ea7b06f37ba0eb97c5b0c32dcdc8bacd">
   <xsd:schema xmlns:xsd="http://www.w3.org/2001/XMLSchema" xmlns:xs="http://www.w3.org/2001/XMLSchema" xmlns:p="http://schemas.microsoft.com/office/2006/metadata/properties" xmlns:ns2="ccbddd15-e9d5-44f6-8841-8b1867f7d865" xmlns:ns3="de1f3595-d17b-4cf1-8be6-3f9a153d3238" targetNamespace="http://schemas.microsoft.com/office/2006/metadata/properties" ma:root="true" ma:fieldsID="20ce38369bd8b68fe887f2343734066d" ns2:_="" ns3:_="">
     <xsd:import namespace="ccbddd15-e9d5-44f6-8841-8b1867f7d865"/>
@@ -9437,10 +10099,6 @@
 </ct:contentTypeSchema>
 </file>
 
-<file path=customXml/item2.xml><?xml version="1.0" encoding="utf-8"?>
-<b:Sources xmlns:b="http://schemas.openxmlformats.org/officeDocument/2006/bibliography" xmlns="http://schemas.openxmlformats.org/officeDocument/2006/bibliography" SelectedStyle="\APASixthEditionOfficeOnline.xsl" StyleName="APA" Version="6"/>
-</file>
-
 <file path=customXml/item3.xml><?xml version="1.0" encoding="utf-8"?>
 <?mso-contentType ?>
 <FormTemplates xmlns="http://schemas.microsoft.com/sharepoint/v3/contenttype/forms">
@@ -9451,6 +10109,14 @@
 </file>
 
 <file path=customXml/itemProps1.xml><?xml version="1.0" encoding="utf-8"?>
+<ds:datastoreItem xmlns:ds="http://schemas.openxmlformats.org/officeDocument/2006/customXml" ds:itemID="{D22F0133-C144-42F7-B3F6-C2A1492A69C5}">
+  <ds:schemaRefs>
+    <ds:schemaRef ds:uri="http://schemas.openxmlformats.org/officeDocument/2006/bibliography"/>
+  </ds:schemaRefs>
+</ds:datastoreItem>
+</file>
+
+<file path=customXml/itemProps2.xml><?xml version="1.0" encoding="utf-8"?>
 <ds:datastoreItem xmlns:ds="http://schemas.openxmlformats.org/officeDocument/2006/customXml" ds:itemID="{B7B6DC1C-F59E-4B89-A220-E20F0C2B76BC}">
   <ds:schemaRefs>
     <ds:schemaRef ds:uri="http://schemas.microsoft.com/office/2006/metadata/contentType"/>
@@ -9469,14 +10135,6 @@
 </ds:datastoreItem>
 </file>
 
-<file path=customXml/itemProps2.xml><?xml version="1.0" encoding="utf-8"?>
-<ds:datastoreItem xmlns:ds="http://schemas.openxmlformats.org/officeDocument/2006/customXml" ds:itemID="{D22F0133-C144-42F7-B3F6-C2A1492A69C5}">
-  <ds:schemaRefs>
-    <ds:schemaRef ds:uri="http://schemas.openxmlformats.org/officeDocument/2006/bibliography"/>
-  </ds:schemaRefs>
-</ds:datastoreItem>
-</file>
-
 <file path=customXml/itemProps3.xml><?xml version="1.0" encoding="utf-8"?>
 <ds:datastoreItem xmlns:ds="http://schemas.openxmlformats.org/officeDocument/2006/customXml" ds:itemID="{BE56040F-5A4D-453F-A494-00ECCD7C3386}">
   <ds:schemaRefs>

</xml_diff>